<commit_message>
docs(finalisation): lancer B1 (brief de relecture native FON/YOR) et B2 (dossier clinique régénéré)
- B1 : brief relecteur docs/i18n/RELECTURE_Native_2026-09.md (6 clés critiques
  sos.* en clair, consignes de remplissage des CSV, circuit de retour et
  double validation §6) ; CSV todo.{fon,yor}.csv régénérés (artefacts, non versionnés).
- B2 : Dossier_Validation_Clinique.docx régénéré depuis @digisante/shared,
  validation structurelle équivalente passée (ZIP/XML/A4/0 \n/page signature).
- État des lieux : statut de lancement consigné en §4.1 et §4.2.

Co-Authored-By: Claude Fable 5 <noreply@anthropic.com>
Claude-Session: https://claude.ai/code/session_01EAm1VA7S1Biqa29pLN2YeG
</commit_message>
<xml_diff>
--- a/docs/Dossier_Validation_Clinique.docx
+++ b/docs/Dossier_Validation_Clinique.docx
@@ -76,7 +76,7 @@
           <w:sz w:val="20"/>
           <w:szCs w:val="20"/>
         </w:rPr>
-        <w:t xml:space="preserve">Version du 2026-07-12</w:t>
+        <w:t xml:space="preserve">Version du 2026-09-01</w:t>
       </w:r>
     </w:p>
     <w:p>
@@ -165,7 +165,7 @@
           <w:sz w:val="20"/>
           <w:szCs w:val="20"/>
         </w:rPr>
-        <w:t xml:space="preserve">Sources (source de vérité) : triage → packages/shared/src/triage.ts · PEV → packages/shared/src/pev.ts · phrasier → packages/shared/src/phrasebook.ts. Instantané généré le 2026-07-12.</w:t>
+        <w:t xml:space="preserve">Sources (source de vérité) : triage → packages/shared/src/triage.ts · PEV → packages/shared/src/pev.ts · phrasier → packages/shared/src/phrasebook.ts. Instantané généré le 2026-09-01.</w:t>
       </w:r>
     </w:p>
     <w:p>

</xml_diff>